<commit_message>
v2: inclusión de la red de pedagogía
</commit_message>
<xml_diff>
--- a/CONVOCATORIA DEVNET.docx
+++ b/CONVOCATORIA DEVNET.docx
@@ -87,7 +87,6 @@
           <w:lang w:eastAsia="es-ES"/>
         </w:rPr>
       </w:pPr>
-      <w:proofErr w:type="spellStart"/>
       <w:r>
         <w:rPr>
           <w:rFonts w:asciiTheme="majorHAnsi" w:eastAsia="Times New Roman" w:hAnsiTheme="majorHAnsi" w:cstheme="majorHAnsi"/>
@@ -98,7 +97,6 @@
         </w:rPr>
         <w:t>DevNet</w:t>
       </w:r>
-      <w:proofErr w:type="spellEnd"/>
       <w:r>
         <w:rPr>
           <w:rFonts w:asciiTheme="majorHAnsi" w:eastAsia="Times New Roman" w:hAnsiTheme="majorHAnsi" w:cstheme="majorHAnsi"/>
@@ -555,6 +553,84 @@
           </w:p>
         </w:tc>
       </w:tr>
+      <w:tr>
+        <w:trPr>
+          <w:trHeight w:val="300"/>
+        </w:trPr>
+        <w:tc>
+          <w:tcPr>
+            <w:tcW w:w="0" w:type="auto"/>
+            <w:vAlign w:val="center"/>
+          </w:tcPr>
+          <w:p>
+            <w:pPr>
+              <w:spacing w:after="0"/>
+              <w:jc w:val="center"/>
+              <w:rPr>
+                <w:rFonts w:asciiTheme="majorHAnsi" w:hAnsiTheme="majorHAnsi" w:cstheme="majorHAnsi"/>
+                <w:color w:val="000000" w:themeColor="text1"/>
+              </w:rPr>
+            </w:pPr>
+            <w:r>
+              <w:rPr>
+                <w:rFonts w:asciiTheme="majorHAnsi" w:hAnsiTheme="majorHAnsi" w:cstheme="majorHAnsi"/>
+                <w:color w:val="000000" w:themeColor="text1"/>
+              </w:rPr>
+              <w:t>PEDAGOGÍA</w:t>
+            </w:r>
+          </w:p>
+        </w:tc>
+        <w:tc>
+          <w:tcPr>
+            <w:tcW w:w="0" w:type="auto"/>
+            <w:vAlign w:val="center"/>
+          </w:tcPr>
+          <w:p>
+            <w:pPr>
+              <w:spacing w:after="0" w:line="240" w:lineRule="auto"/>
+              <w:jc w:val="center"/>
+              <w:rPr>
+                <w:rFonts w:asciiTheme="majorHAnsi" w:hAnsiTheme="majorHAnsi" w:cstheme="majorHAnsi"/>
+                <w:color w:val="000000" w:themeColor="text1"/>
+                <w:lang w:bidi="es-ES"/>
+              </w:rPr>
+            </w:pPr>
+            <w:r>
+              <w:rPr>
+                <w:rFonts w:asciiTheme="majorHAnsi" w:hAnsiTheme="majorHAnsi" w:cstheme="majorHAnsi"/>
+                <w:color w:val="000000" w:themeColor="text1"/>
+                <w:lang w:bidi="es-ES"/>
+              </w:rPr>
+              <w:t>TODAS</w:t>
+            </w:r>
+          </w:p>
+        </w:tc>
+        <w:tc>
+          <w:tcPr>
+            <w:tcW w:w="4627" w:type="dxa"/>
+            <w:vAlign w:val="center"/>
+          </w:tcPr>
+          <w:p>
+            <w:pPr>
+              <w:spacing w:after="0" w:line="240" w:lineRule="auto"/>
+              <w:jc w:val="both"/>
+              <w:rPr>
+                <w:rFonts w:asciiTheme="majorHAnsi" w:hAnsiTheme="majorHAnsi" w:cstheme="majorHAnsi"/>
+                <w:color w:val="000000" w:themeColor="text1"/>
+                <w:lang w:bidi="es-ES"/>
+              </w:rPr>
+            </w:pPr>
+            <w:r>
+              <w:rPr>
+                <w:rFonts w:asciiTheme="majorHAnsi" w:hAnsiTheme="majorHAnsi" w:cstheme="majorHAnsi"/>
+                <w:color w:val="000000" w:themeColor="text1"/>
+                <w:lang w:bidi="es-ES"/>
+              </w:rPr>
+              <w:t>Incluir software en pedagogia</w:t>
+            </w:r>
+          </w:p>
+        </w:tc>
+      </w:tr>
     </w:tbl>
     <w:bookmarkEnd w:id="0"/>
     <w:p>
@@ -691,9 +767,8 @@
           <w:sz w:val="22"/>
           <w:szCs w:val="22"/>
         </w:rPr>
-        <w:t xml:space="preserve">En este contexto, </w:t>
-      </w:r>
-      <w:proofErr w:type="spellStart"/>
+        <w:t xml:space="preserve">En este contexto, DevNet se presenta como una iniciativa clave que integra el desarrollo de software con el conocimiento en redes, permitiendo a los profesionales automatizar tareas, integrar sistemas, mejorar tiempos de respuesta ante incidentes y reducir la complejidad </w:t>
+      </w:r>
       <w:r>
         <w:rPr>
           <w:rFonts w:asciiTheme="majorHAnsi" w:hAnsiTheme="majorHAnsi" w:cstheme="majorHAnsi"/>
@@ -701,9 +776,9 @@
           <w:sz w:val="22"/>
           <w:szCs w:val="22"/>
         </w:rPr>
-        <w:t>DevNet</w:t>
-      </w:r>
-      <w:proofErr w:type="spellEnd"/>
+        <w:lastRenderedPageBreak/>
+        <w:t>operativa en entornos de red híbridos (físicos y virtualizados)</w:t>
+      </w:r>
       <w:r>
         <w:rPr>
           <w:rFonts w:asciiTheme="majorHAnsi" w:hAnsiTheme="majorHAnsi" w:cstheme="majorHAnsi"/>
@@ -711,7 +786,7 @@
           <w:sz w:val="22"/>
           <w:szCs w:val="22"/>
         </w:rPr>
-        <w:t xml:space="preserve"> se presenta como una iniciativa clave que integra el desarrollo de software con el conocimiento en redes, permitiendo a los profesionales automatizar tareas, integrar sistemas, mejorar tiempos de respuesta ante incidentes y reducir la complejidad operativa en entornos de red híbridos (físicos y virtualizados)</w:t>
+        <w:t xml:space="preserve">, avanzando así </w:t>
       </w:r>
       <w:r>
         <w:rPr>
@@ -720,8 +795,19 @@
           <w:sz w:val="22"/>
           <w:szCs w:val="22"/>
         </w:rPr>
-        <w:t xml:space="preserve">, avanzando así </w:t>
-      </w:r>
+        <w:t>hacia modelos de operación más ágiles, escalables y sostenibles en sectores como educación, salud, agricultura, industria y administración pública.</w:t>
+      </w:r>
+    </w:p>
+    <w:p>
+      <w:pPr>
+        <w:pStyle w:val="NormalWeb"/>
+        <w:jc w:val="both"/>
+        <w:rPr>
+          <w:rFonts w:asciiTheme="majorHAnsi" w:hAnsiTheme="majorHAnsi" w:cstheme="majorHAnsi"/>
+          <w:b/>
+          <w:bCs/>
+        </w:rPr>
+      </w:pPr>
       <w:r>
         <w:rPr>
           <w:rFonts w:asciiTheme="majorHAnsi" w:hAnsiTheme="majorHAnsi" w:cstheme="majorHAnsi"/>
@@ -729,7 +815,7 @@
           <w:sz w:val="22"/>
           <w:szCs w:val="22"/>
         </w:rPr>
-        <w:t xml:space="preserve">hacia modelos de </w:t>
+        <w:t>Por lo anterior,</w:t>
       </w:r>
       <w:r>
         <w:rPr>
@@ -738,141 +824,99 @@
           <w:sz w:val="22"/>
           <w:szCs w:val="22"/>
         </w:rPr>
-        <w:lastRenderedPageBreak/>
-        <w:t>operación más ágiles, escalables y sostenibles en sectores como educación, salud, agricultura, industria y administración pública.</w:t>
-      </w:r>
-    </w:p>
-    <w:p>
-      <w:pPr>
-        <w:pStyle w:val="NormalWeb"/>
-        <w:jc w:val="both"/>
+        <w:t xml:space="preserve"> </w:t>
+      </w:r>
+      <w:r>
+        <w:rPr>
+          <w:rFonts w:asciiTheme="majorHAnsi" w:hAnsiTheme="majorHAnsi" w:cstheme="majorHAnsi"/>
+          <w:color w:val="000000" w:themeColor="text1"/>
+          <w:sz w:val="22"/>
+          <w:szCs w:val="22"/>
+        </w:rPr>
+        <w:t>l</w:t>
+      </w:r>
+      <w:r>
+        <w:rPr>
+          <w:rFonts w:asciiTheme="majorHAnsi" w:hAnsiTheme="majorHAnsi" w:cstheme="majorHAnsi"/>
+          <w:color w:val="000000" w:themeColor="text1"/>
+          <w:sz w:val="22"/>
+          <w:szCs w:val="22"/>
+        </w:rPr>
+        <w:t>a Dirección de Formación Profesional (DFP)</w:t>
+      </w:r>
+      <w:r>
+        <w:rPr>
+          <w:rStyle w:val="Refdenotaalpie"/>
+          <w:rFonts w:asciiTheme="majorHAnsi" w:hAnsiTheme="majorHAnsi" w:cstheme="majorHAnsi"/>
+          <w:color w:val="000000" w:themeColor="text1"/>
+          <w:sz w:val="22"/>
+          <w:szCs w:val="22"/>
+        </w:rPr>
+        <w:t xml:space="preserve"> </w:t>
+      </w:r>
+      <w:r>
+        <w:rPr>
+          <w:rStyle w:val="Refdenotaalpie"/>
+          <w:rFonts w:asciiTheme="majorHAnsi" w:hAnsiTheme="majorHAnsi" w:cstheme="majorHAnsi"/>
+          <w:color w:val="000000" w:themeColor="text1"/>
+          <w:sz w:val="22"/>
+          <w:szCs w:val="22"/>
+        </w:rPr>
+        <w:footnoteReference w:id="1"/>
+      </w:r>
+      <w:r>
+        <w:rPr>
+          <w:rFonts w:asciiTheme="majorHAnsi" w:hAnsiTheme="majorHAnsi" w:cstheme="majorHAnsi"/>
+          <w:color w:val="000000" w:themeColor="text1"/>
+          <w:sz w:val="22"/>
+          <w:szCs w:val="22"/>
+        </w:rPr>
+        <w:t xml:space="preserve"> en desarrollo de sus objetivos y propósitos, dirigidos a la permanente actualización y desarrollo de competencias que implican un avance en las capacidades y habilidades técnicas de los instructores en la institución, abre </w:t>
+      </w:r>
+      <w:r>
+        <w:rPr>
+          <w:rFonts w:asciiTheme="majorHAnsi" w:hAnsiTheme="majorHAnsi" w:cstheme="majorHAnsi"/>
+          <w:color w:val="000000" w:themeColor="text1"/>
+          <w:sz w:val="22"/>
+          <w:szCs w:val="22"/>
+        </w:rPr>
+        <w:t>la</w:t>
+      </w:r>
+      <w:r>
+        <w:rPr>
+          <w:rFonts w:asciiTheme="majorHAnsi" w:hAnsiTheme="majorHAnsi" w:cstheme="majorHAnsi"/>
+          <w:color w:val="000000" w:themeColor="text1"/>
+          <w:sz w:val="22"/>
+          <w:szCs w:val="22"/>
+        </w:rPr>
+        <w:t xml:space="preserve"> convocatoria</w:t>
+      </w:r>
+      <w:r>
+        <w:rPr>
+          <w:rFonts w:asciiTheme="majorHAnsi" w:hAnsiTheme="majorHAnsi" w:cstheme="majorHAnsi"/>
+          <w:color w:val="000000" w:themeColor="text1"/>
+          <w:sz w:val="22"/>
+          <w:szCs w:val="22"/>
+        </w:rPr>
+        <w:t xml:space="preserve"> </w:t>
+      </w:r>
+      <w:r>
         <w:rPr>
           <w:rFonts w:asciiTheme="majorHAnsi" w:hAnsiTheme="majorHAnsi" w:cstheme="majorHAnsi"/>
           <w:b/>
           <w:bCs/>
         </w:rPr>
-      </w:pPr>
-      <w:r>
-        <w:rPr>
-          <w:rFonts w:asciiTheme="majorHAnsi" w:hAnsiTheme="majorHAnsi" w:cstheme="majorHAnsi"/>
-          <w:color w:val="000000" w:themeColor="text1"/>
-          <w:sz w:val="22"/>
-          <w:szCs w:val="22"/>
-        </w:rPr>
-        <w:t>Por lo anterior,</w:t>
-      </w:r>
-      <w:r>
-        <w:rPr>
-          <w:rFonts w:asciiTheme="majorHAnsi" w:hAnsiTheme="majorHAnsi" w:cstheme="majorHAnsi"/>
-          <w:color w:val="000000" w:themeColor="text1"/>
-          <w:sz w:val="22"/>
-          <w:szCs w:val="22"/>
-        </w:rPr>
-        <w:t xml:space="preserve"> </w:t>
-      </w:r>
-      <w:r>
-        <w:rPr>
-          <w:rFonts w:asciiTheme="majorHAnsi" w:hAnsiTheme="majorHAnsi" w:cstheme="majorHAnsi"/>
-          <w:color w:val="000000" w:themeColor="text1"/>
-          <w:sz w:val="22"/>
-          <w:szCs w:val="22"/>
-        </w:rPr>
-        <w:t>l</w:t>
-      </w:r>
-      <w:r>
-        <w:rPr>
-          <w:rFonts w:asciiTheme="majorHAnsi" w:hAnsiTheme="majorHAnsi" w:cstheme="majorHAnsi"/>
-          <w:color w:val="000000" w:themeColor="text1"/>
-          <w:sz w:val="22"/>
-          <w:szCs w:val="22"/>
-        </w:rPr>
-        <w:t>a Dirección de Formación Profesional (DFP)</w:t>
-      </w:r>
-      <w:r>
-        <w:rPr>
-          <w:rStyle w:val="Refdenotaalpie"/>
-          <w:rFonts w:asciiTheme="majorHAnsi" w:hAnsiTheme="majorHAnsi" w:cstheme="majorHAnsi"/>
-          <w:color w:val="000000" w:themeColor="text1"/>
-          <w:sz w:val="22"/>
-          <w:szCs w:val="22"/>
-        </w:rPr>
-        <w:t xml:space="preserve"> </w:t>
-      </w:r>
-      <w:r>
-        <w:rPr>
-          <w:rStyle w:val="Refdenotaalpie"/>
-          <w:rFonts w:asciiTheme="majorHAnsi" w:hAnsiTheme="majorHAnsi" w:cstheme="majorHAnsi"/>
-          <w:color w:val="000000" w:themeColor="text1"/>
-          <w:sz w:val="22"/>
-          <w:szCs w:val="22"/>
-        </w:rPr>
-        <w:footnoteReference w:id="1"/>
-      </w:r>
-      <w:r>
-        <w:rPr>
-          <w:rFonts w:asciiTheme="majorHAnsi" w:hAnsiTheme="majorHAnsi" w:cstheme="majorHAnsi"/>
-          <w:color w:val="000000" w:themeColor="text1"/>
-          <w:sz w:val="22"/>
-          <w:szCs w:val="22"/>
-        </w:rPr>
-        <w:t xml:space="preserve"> en desarrollo de sus objetivos y propósitos, dirigidos a la permanente actualización y desarrollo de competencias que implican un avance en las capacidades y habilidades técnicas de los instructores en la institución, abre </w:t>
-      </w:r>
-      <w:r>
-        <w:rPr>
-          <w:rFonts w:asciiTheme="majorHAnsi" w:hAnsiTheme="majorHAnsi" w:cstheme="majorHAnsi"/>
-          <w:color w:val="000000" w:themeColor="text1"/>
-          <w:sz w:val="22"/>
-          <w:szCs w:val="22"/>
-        </w:rPr>
-        <w:t>la</w:t>
-      </w:r>
-      <w:r>
-        <w:rPr>
-          <w:rFonts w:asciiTheme="majorHAnsi" w:hAnsiTheme="majorHAnsi" w:cstheme="majorHAnsi"/>
-          <w:color w:val="000000" w:themeColor="text1"/>
-          <w:sz w:val="22"/>
-          <w:szCs w:val="22"/>
-        </w:rPr>
-        <w:t xml:space="preserve"> convocatoria</w:t>
-      </w:r>
-      <w:r>
-        <w:rPr>
-          <w:rFonts w:asciiTheme="majorHAnsi" w:hAnsiTheme="majorHAnsi" w:cstheme="majorHAnsi"/>
-          <w:color w:val="000000" w:themeColor="text1"/>
-          <w:sz w:val="22"/>
-          <w:szCs w:val="22"/>
-        </w:rPr>
-        <w:t xml:space="preserve"> </w:t>
+        <w:t>“</w:t>
       </w:r>
       <w:r>
         <w:rPr>
           <w:rFonts w:asciiTheme="majorHAnsi" w:hAnsiTheme="majorHAnsi" w:cstheme="majorHAnsi"/>
           <w:b/>
           <w:bCs/>
-        </w:rPr>
-        <w:t>“</w:t>
-      </w:r>
-      <w:proofErr w:type="spellStart"/>
-      <w:r>
-        <w:rPr>
-          <w:rFonts w:asciiTheme="majorHAnsi" w:hAnsiTheme="majorHAnsi" w:cstheme="majorHAnsi"/>
-          <w:b/>
-          <w:bCs/>
           <w:color w:val="000000" w:themeColor="text1"/>
           <w:lang w:eastAsia="es-ES"/>
         </w:rPr>
-        <w:t>DevNet</w:t>
-      </w:r>
-      <w:proofErr w:type="spellEnd"/>
-      <w:r>
-        <w:rPr>
-          <w:rFonts w:asciiTheme="majorHAnsi" w:hAnsiTheme="majorHAnsi" w:cstheme="majorHAnsi"/>
-          <w:b/>
-          <w:bCs/>
-          <w:color w:val="000000" w:themeColor="text1"/>
-          <w:lang w:eastAsia="es-ES"/>
-        </w:rPr>
-        <w:t>: Desarrollo de Software para la Automatización de Redes Nivel Básico</w:t>
+        <w:t>DevNet: Desarrollo de Software para la Automatización de Redes Nivel Básico</w:t>
       </w:r>
       <w:r>
         <w:rPr>
@@ -1780,6 +1824,7 @@
           <w:sz w:val="22"/>
           <w:szCs w:val="22"/>
         </w:rPr>
+        <w:lastRenderedPageBreak/>
         <w:t>Jornada Presencial Sincrónica mediada por TIC</w:t>
       </w:r>
       <w:r>
@@ -1986,7 +2031,6 @@
                 <w:b/>
                 <w:color w:val="auto"/>
               </w:rPr>
-              <w:lastRenderedPageBreak/>
               <w:t>Fecha</w:t>
             </w:r>
           </w:p>
@@ -2352,20 +2396,8 @@
                 <w:sz w:val="18"/>
                 <w:szCs w:val="18"/>
               </w:rPr>
-              <w:t xml:space="preserve"> al curso </w:t>
-            </w:r>
-            <w:proofErr w:type="spellStart"/>
-            <w:r>
-              <w:rPr>
-                <w:rFonts w:eastAsiaTheme="minorEastAsia"/>
-                <w:bCs/>
-                <w:color w:val="000000" w:themeColor="text1"/>
-                <w:sz w:val="18"/>
-                <w:szCs w:val="18"/>
-              </w:rPr>
-              <w:t>DevNet</w:t>
-            </w:r>
-            <w:proofErr w:type="spellEnd"/>
+              <w:t xml:space="preserve"> al curso DevNet</w:t>
+            </w:r>
           </w:p>
           <w:p>
             <w:pPr>
@@ -2388,20 +2420,8 @@
                 <w:sz w:val="18"/>
                 <w:szCs w:val="18"/>
               </w:rPr>
-              <w:t xml:space="preserve">Módulo 2 Entorno de desarrolladores de </w:t>
-            </w:r>
-            <w:proofErr w:type="spellStart"/>
-            <w:r>
-              <w:rPr>
-                <w:rFonts w:eastAsiaTheme="minorEastAsia"/>
-                <w:bCs/>
-                <w:color w:val="000000" w:themeColor="text1"/>
-                <w:sz w:val="18"/>
-                <w:szCs w:val="18"/>
-              </w:rPr>
-              <w:t>DevNet</w:t>
-            </w:r>
-            <w:proofErr w:type="spellEnd"/>
+              <w:t>Módulo 2 Entorno de desarrolladores de DevNet</w:t>
+            </w:r>
           </w:p>
           <w:p>
             <w:pPr>
@@ -2450,42 +2470,8 @@
                 <w:sz w:val="18"/>
                 <w:szCs w:val="18"/>
               </w:rPr>
-              <w:t xml:space="preserve">1.2.2 </w:t>
-            </w:r>
-            <w:proofErr w:type="spellStart"/>
-            <w:r>
-              <w:rPr>
-                <w:rFonts w:eastAsiaTheme="minorEastAsia"/>
-                <w:bCs/>
-                <w:color w:val="000000" w:themeColor="text1"/>
-                <w:sz w:val="18"/>
-                <w:szCs w:val="18"/>
-              </w:rPr>
-              <w:t>Lab</w:t>
-            </w:r>
-            <w:proofErr w:type="spellEnd"/>
-            <w:r>
-              <w:rPr>
-                <w:rFonts w:eastAsiaTheme="minorEastAsia"/>
-                <w:bCs/>
-                <w:color w:val="000000" w:themeColor="text1"/>
-                <w:sz w:val="18"/>
-                <w:szCs w:val="18"/>
-              </w:rPr>
-              <w:t xml:space="preserve"> - Linux </w:t>
-            </w:r>
-            <w:proofErr w:type="spellStart"/>
-            <w:r>
-              <w:rPr>
-                <w:rFonts w:eastAsiaTheme="minorEastAsia"/>
-                <w:bCs/>
-                <w:color w:val="000000" w:themeColor="text1"/>
-                <w:sz w:val="18"/>
-                <w:szCs w:val="18"/>
-              </w:rPr>
-              <w:t>Review</w:t>
-            </w:r>
-            <w:proofErr w:type="spellEnd"/>
+              <w:t>1.2.2 Lab - Linux Review</w:t>
+            </w:r>
           </w:p>
         </w:tc>
       </w:tr>
@@ -4862,73 +4848,7 @@
                 <w:sz w:val="18"/>
                 <w:szCs w:val="18"/>
               </w:rPr>
-              <w:t xml:space="preserve">7.0.3 </w:t>
-            </w:r>
-            <w:proofErr w:type="spellStart"/>
-            <w:r>
-              <w:rPr>
-                <w:rFonts w:eastAsiaTheme="minorEastAsia"/>
-                <w:bCs/>
-                <w:color w:val="000000" w:themeColor="text1"/>
-                <w:sz w:val="18"/>
-                <w:szCs w:val="18"/>
-              </w:rPr>
-              <w:t>Lab</w:t>
-            </w:r>
-            <w:proofErr w:type="spellEnd"/>
-            <w:r>
-              <w:rPr>
-                <w:rFonts w:eastAsiaTheme="minorEastAsia"/>
-                <w:bCs/>
-                <w:color w:val="000000" w:themeColor="text1"/>
-                <w:sz w:val="18"/>
-                <w:szCs w:val="18"/>
-              </w:rPr>
-              <w:t xml:space="preserve"> - </w:t>
-            </w:r>
-            <w:proofErr w:type="spellStart"/>
-            <w:r>
-              <w:rPr>
-                <w:rFonts w:eastAsiaTheme="minorEastAsia"/>
-                <w:bCs/>
-                <w:color w:val="000000" w:themeColor="text1"/>
-                <w:sz w:val="18"/>
-                <w:szCs w:val="18"/>
-              </w:rPr>
-              <w:t>Install</w:t>
-            </w:r>
-            <w:proofErr w:type="spellEnd"/>
-            <w:r>
-              <w:rPr>
-                <w:rFonts w:eastAsiaTheme="minorEastAsia"/>
-                <w:bCs/>
-                <w:color w:val="000000" w:themeColor="text1"/>
-                <w:sz w:val="18"/>
-                <w:szCs w:val="18"/>
-              </w:rPr>
-              <w:t xml:space="preserve"> </w:t>
-            </w:r>
-            <w:proofErr w:type="spellStart"/>
-            <w:r>
-              <w:rPr>
-                <w:rFonts w:eastAsiaTheme="minorEastAsia"/>
-                <w:bCs/>
-                <w:color w:val="000000" w:themeColor="text1"/>
-                <w:sz w:val="18"/>
-                <w:szCs w:val="18"/>
-              </w:rPr>
-              <w:t>the</w:t>
-            </w:r>
-            <w:proofErr w:type="spellEnd"/>
-            <w:r>
-              <w:rPr>
-                <w:rFonts w:eastAsiaTheme="minorEastAsia"/>
-                <w:bCs/>
-                <w:color w:val="000000" w:themeColor="text1"/>
-                <w:sz w:val="18"/>
-                <w:szCs w:val="18"/>
-              </w:rPr>
-              <w:t xml:space="preserve"> CSR1000v VM </w:t>
+              <w:t xml:space="preserve">7.0.3 Lab - Install the CSR1000v VM </w:t>
             </w:r>
           </w:p>
           <w:p>
@@ -5009,31 +4929,7 @@
                 <w:szCs w:val="18"/>
                 <w:lang w:val="en-US"/>
               </w:rPr>
-              <w:t xml:space="preserve">7.6.3 Lab - Automated Testing Using </w:t>
-            </w:r>
-            <w:proofErr w:type="spellStart"/>
-            <w:r>
-              <w:rPr>
-                <w:rFonts w:eastAsiaTheme="minorEastAsia"/>
-                <w:bCs/>
-                <w:color w:val="000000" w:themeColor="text1"/>
-                <w:sz w:val="18"/>
-                <w:szCs w:val="18"/>
-                <w:lang w:val="en-US"/>
-              </w:rPr>
-              <w:t>pyATS</w:t>
-            </w:r>
-            <w:proofErr w:type="spellEnd"/>
-            <w:r>
-              <w:rPr>
-                <w:rFonts w:eastAsiaTheme="minorEastAsia"/>
-                <w:bCs/>
-                <w:color w:val="000000" w:themeColor="text1"/>
-                <w:sz w:val="18"/>
-                <w:szCs w:val="18"/>
-                <w:lang w:val="en-US"/>
-              </w:rPr>
-              <w:t xml:space="preserve"> and Genie</w:t>
+              <w:t>7.6.3 Lab - Automated Testing Using pyATS and Genie</w:t>
             </w:r>
           </w:p>
           <w:p>
@@ -5581,42 +5477,8 @@
                 <w:sz w:val="18"/>
                 <w:szCs w:val="18"/>
               </w:rPr>
-              <w:t xml:space="preserve">8 Desarrollo y Plataformas de </w:t>
-            </w:r>
-            <w:proofErr w:type="spellStart"/>
-            <w:r>
-              <w:rPr>
-                <w:rFonts w:eastAsiaTheme="minorEastAsia"/>
-                <w:bCs/>
-                <w:color w:val="000000" w:themeColor="text1"/>
-                <w:sz w:val="18"/>
-                <w:szCs w:val="18"/>
-              </w:rPr>
-              <w:t>CiscoExternal</w:t>
-            </w:r>
-            <w:proofErr w:type="spellEnd"/>
-            <w:r>
-              <w:rPr>
-                <w:rFonts w:eastAsiaTheme="minorEastAsia"/>
-                <w:bCs/>
-                <w:color w:val="000000" w:themeColor="text1"/>
-                <w:sz w:val="18"/>
-                <w:szCs w:val="18"/>
-              </w:rPr>
-              <w:t xml:space="preserve"> </w:t>
-            </w:r>
-            <w:proofErr w:type="spellStart"/>
-            <w:r>
-              <w:rPr>
-                <w:rFonts w:eastAsiaTheme="minorEastAsia"/>
-                <w:bCs/>
-                <w:color w:val="000000" w:themeColor="text1"/>
-                <w:sz w:val="18"/>
-                <w:szCs w:val="18"/>
-              </w:rPr>
-              <w:t>tool</w:t>
-            </w:r>
-            <w:proofErr w:type="spellEnd"/>
+              <w:t>8 Desarrollo y Plataformas de CiscoExternal tool</w:t>
+            </w:r>
           </w:p>
           <w:p>
             <w:pPr>
@@ -6167,21 +6029,7 @@
         <w:rPr>
           <w:bCs/>
         </w:rPr>
-        <w:t xml:space="preserve">y Certificación en plataforma de Cisco </w:t>
-      </w:r>
-      <w:proofErr w:type="spellStart"/>
-      <w:r>
-        <w:rPr>
-          <w:bCs/>
-        </w:rPr>
-        <w:t>Netacad</w:t>
-      </w:r>
-      <w:proofErr w:type="spellEnd"/>
-      <w:r>
-        <w:rPr>
-          <w:bCs/>
-        </w:rPr>
-        <w:t xml:space="preserve"> </w:t>
+        <w:t xml:space="preserve">y Certificación en plataforma de Cisco Netacad </w:t>
       </w:r>
     </w:p>
     <w:p>
@@ -6948,7 +6796,6 @@
                 <w:color w:val="000000" w:themeColor="text1"/>
               </w:rPr>
             </w:pPr>
-            <w:proofErr w:type="spellStart"/>
             <w:r>
               <w:rPr>
                 <w:rFonts w:asciiTheme="majorHAnsi" w:hAnsiTheme="majorHAnsi" w:cstheme="majorHAnsi"/>
@@ -6957,7 +6804,6 @@
               </w:rPr>
               <w:t>Teams</w:t>
             </w:r>
-            <w:proofErr w:type="spellEnd"/>
             <w:r>
               <w:rPr>
                 <w:rFonts w:asciiTheme="majorHAnsi" w:hAnsiTheme="majorHAnsi" w:cstheme="majorHAnsi"/>
@@ -6974,23 +6820,13 @@
               </w:rPr>
               <w:t xml:space="preserve"> </w:t>
             </w:r>
-            <w:proofErr w:type="spellStart"/>
             <w:r>
               <w:rPr>
                 <w:rFonts w:asciiTheme="majorHAnsi" w:hAnsiTheme="majorHAnsi" w:cstheme="majorHAnsi"/>
                 <w:bCs/>
                 <w:color w:val="000000" w:themeColor="text1"/>
               </w:rPr>
-              <w:t>Webex</w:t>
-            </w:r>
-            <w:proofErr w:type="spellEnd"/>
-            <w:r>
-              <w:rPr>
-                <w:rFonts w:asciiTheme="majorHAnsi" w:hAnsiTheme="majorHAnsi" w:cstheme="majorHAnsi"/>
-                <w:bCs/>
-                <w:color w:val="000000" w:themeColor="text1"/>
-              </w:rPr>
-              <w:t xml:space="preserve"> </w:t>
+              <w:t xml:space="preserve">Webex </w:t>
             </w:r>
             <w:r>
               <w:rPr>
@@ -8050,28 +7886,13 @@
           <w:b/>
           <w:bCs/>
         </w:rPr>
-        <w:t xml:space="preserve">, </w:t>
+        <w:t>, 21730061         FUNDAMENTOS DE PROGRAMACIÓN  60 horas</w:t>
       </w:r>
       <w:r>
         <w:rPr>
           <w:b/>
           <w:bCs/>
         </w:rPr>
-        <w:t xml:space="preserve">21730061         FUNDAMENTOS DE PROGRAMACIÓN  60 </w:t>
-      </w:r>
-      <w:proofErr w:type="gramStart"/>
-      <w:r>
-        <w:rPr>
-          <w:b/>
-          <w:bCs/>
-        </w:rPr>
-        <w:t>horas</w:t>
-      </w:r>
-      <w:r>
-        <w:rPr>
-          <w:b/>
-          <w:bCs/>
-        </w:rPr>
         <w:t xml:space="preserve"> </w:t>
       </w:r>
       <w:r>
@@ -8088,7 +7909,6 @@
         </w:rPr>
         <w:t>ara</w:t>
       </w:r>
-      <w:proofErr w:type="gramEnd"/>
       <w:r>
         <w:rPr>
           <w:rFonts w:asciiTheme="majorHAnsi" w:hAnsiTheme="majorHAnsi" w:cstheme="majorHAnsi"/>
@@ -8761,21 +8581,12 @@
         </w:rPr>
         <w:tab/>
       </w:r>
-      <w:proofErr w:type="spellStart"/>
-      <w:r>
-        <w:rPr>
-          <w:rFonts w:asciiTheme="majorHAnsi" w:hAnsiTheme="majorHAnsi" w:cstheme="majorHAnsi"/>
-          <w:color w:val="000000" w:themeColor="text1"/>
-        </w:rPr>
-        <w:t>CC_No</w:t>
-      </w:r>
-      <w:proofErr w:type="spellEnd"/>
-      <w:r>
-        <w:rPr>
-          <w:rFonts w:asciiTheme="majorHAnsi" w:hAnsiTheme="majorHAnsi" w:cstheme="majorHAnsi"/>
-          <w:color w:val="000000" w:themeColor="text1"/>
-        </w:rPr>
-        <w:t>. CÉDULA _Nombre del instructor Ejemplo: CC_12345678_ Jaime López</w:t>
+      <w:r>
+        <w:rPr>
+          <w:rFonts w:asciiTheme="majorHAnsi" w:hAnsiTheme="majorHAnsi" w:cstheme="majorHAnsi"/>
+          <w:color w:val="000000" w:themeColor="text1"/>
+        </w:rPr>
+        <w:t>CC_No. CÉDULA _Nombre del instructor Ejemplo: CC_12345678_ Jaime López</w:t>
       </w:r>
     </w:p>
     <w:p>
@@ -8823,46 +8634,12 @@
         </w:rPr>
         <w:tab/>
       </w:r>
-      <w:proofErr w:type="spellStart"/>
-      <w:r>
-        <w:rPr>
-          <w:rFonts w:asciiTheme="majorHAnsi" w:hAnsiTheme="majorHAnsi" w:cstheme="majorHAnsi"/>
-          <w:color w:val="000000" w:themeColor="text1"/>
-        </w:rPr>
-        <w:t>ACTA_CC_</w:t>
-      </w:r>
-      <w:proofErr w:type="gramStart"/>
-      <w:r>
-        <w:rPr>
-          <w:rFonts w:asciiTheme="majorHAnsi" w:hAnsiTheme="majorHAnsi" w:cstheme="majorHAnsi"/>
-          <w:color w:val="000000" w:themeColor="text1"/>
-        </w:rPr>
-        <w:t>No.CÉDULA</w:t>
-      </w:r>
-      <w:proofErr w:type="spellEnd"/>
-      <w:proofErr w:type="gramEnd"/>
-      <w:r>
-        <w:rPr>
-          <w:rFonts w:asciiTheme="majorHAnsi" w:hAnsiTheme="majorHAnsi" w:cstheme="majorHAnsi"/>
-          <w:color w:val="000000" w:themeColor="text1"/>
-        </w:rPr>
-        <w:t xml:space="preserve"> _Jaime López (</w:t>
-      </w:r>
-      <w:proofErr w:type="gramStart"/>
-      <w:r>
-        <w:rPr>
-          <w:rFonts w:asciiTheme="majorHAnsi" w:hAnsiTheme="majorHAnsi" w:cstheme="majorHAnsi"/>
-          <w:color w:val="000000" w:themeColor="text1"/>
-        </w:rPr>
-        <w:t>PDF)  Ejemplo</w:t>
-      </w:r>
-      <w:proofErr w:type="gramEnd"/>
-      <w:r>
-        <w:rPr>
-          <w:rFonts w:asciiTheme="majorHAnsi" w:hAnsiTheme="majorHAnsi" w:cstheme="majorHAnsi"/>
-          <w:color w:val="000000" w:themeColor="text1"/>
-        </w:rPr>
-        <w:t>: ACTA_CC_12345678_ Jaime López</w:t>
+      <w:r>
+        <w:rPr>
+          <w:rFonts w:asciiTheme="majorHAnsi" w:hAnsiTheme="majorHAnsi" w:cstheme="majorHAnsi"/>
+          <w:color w:val="000000" w:themeColor="text1"/>
+        </w:rPr>
+        <w:t>ACTA_CC_No.CÉDULA _Jaime López (PDF)  Ejemplo: ACTA_CC_12345678_ Jaime López</w:t>
       </w:r>
     </w:p>
     <w:p>
@@ -10685,21 +10462,12 @@
         </w:rPr>
         <w:t xml:space="preserve"> </w:t>
       </w:r>
-      <w:proofErr w:type="spellStart"/>
-      <w:r>
-        <w:rPr>
-          <w:rFonts w:asciiTheme="majorHAnsi" w:hAnsiTheme="majorHAnsi" w:cstheme="majorHAnsi"/>
-          <w:color w:val="000000" w:themeColor="text1"/>
-        </w:rPr>
-        <w:t>CompromISO</w:t>
-      </w:r>
-      <w:proofErr w:type="spellEnd"/>
-      <w:r>
-        <w:rPr>
-          <w:rFonts w:asciiTheme="majorHAnsi" w:hAnsiTheme="majorHAnsi" w:cstheme="majorHAnsi"/>
-          <w:color w:val="000000" w:themeColor="text1"/>
-        </w:rPr>
-        <w:t>.</w:t>
+      <w:r>
+        <w:rPr>
+          <w:rFonts w:asciiTheme="majorHAnsi" w:hAnsiTheme="majorHAnsi" w:cstheme="majorHAnsi"/>
+          <w:color w:val="000000" w:themeColor="text1"/>
+        </w:rPr>
+        <w:t>CompromISO.</w:t>
       </w:r>
     </w:p>
     <w:p>
@@ -10981,23 +10749,13 @@
           <w:color w:val="000000" w:themeColor="text1"/>
         </w:rPr>
       </w:pPr>
-      <w:proofErr w:type="spellStart"/>
       <w:r>
         <w:rPr>
           <w:rFonts w:asciiTheme="majorHAnsi" w:hAnsiTheme="majorHAnsi" w:cstheme="majorHAnsi"/>
           <w:b/>
           <w:color w:val="000000" w:themeColor="text1"/>
         </w:rPr>
-        <w:t>Dannin</w:t>
-      </w:r>
-      <w:proofErr w:type="spellEnd"/>
-      <w:r>
-        <w:rPr>
-          <w:rFonts w:asciiTheme="majorHAnsi" w:hAnsiTheme="majorHAnsi" w:cstheme="majorHAnsi"/>
-          <w:b/>
-          <w:color w:val="000000" w:themeColor="text1"/>
-        </w:rPr>
-        <w:t xml:space="preserve"> Leonardo Gómez Rodríguez</w:t>
+        <w:t>Dannin Leonardo Gómez Rodríguez</w:t>
       </w:r>
     </w:p>
     <w:p>
@@ -13319,6 +13077,7 @@
   <w:style w:type="character" w:default="1" w:styleId="Fuentedeprrafopredeter">
     <w:name w:val="Default Paragraph Font"/>
     <w:uiPriority w:val="1"/>
+    <w:semiHidden/>
     <w:unhideWhenUsed/>
   </w:style>
   <w:style w:type="table" w:default="1" w:styleId="Tablanormal">

</xml_diff>

<commit_message>
v3 se agrega red infraestructura
</commit_message>
<xml_diff>
--- a/CONVOCATORIA DEVNET.docx
+++ b/CONVOCATORIA DEVNET.docx
@@ -87,7 +87,6 @@
           <w:lang w:eastAsia="es-ES"/>
         </w:rPr>
       </w:pPr>
-      <w:proofErr w:type="spellStart"/>
       <w:r>
         <w:rPr>
           <w:rFonts w:asciiTheme="majorHAnsi" w:eastAsia="Times New Roman" w:hAnsiTheme="majorHAnsi" w:cstheme="majorHAnsi"/>
@@ -98,7 +97,6 @@
         </w:rPr>
         <w:t>DevNet</w:t>
       </w:r>
-      <w:proofErr w:type="spellEnd"/>
       <w:r>
         <w:rPr>
           <w:rFonts w:asciiTheme="majorHAnsi" w:eastAsia="Times New Roman" w:hAnsiTheme="majorHAnsi" w:cstheme="majorHAnsi"/>
@@ -628,18 +626,86 @@
                 <w:color w:val="000000" w:themeColor="text1"/>
                 <w:lang w:bidi="es-ES"/>
               </w:rPr>
-              <w:t xml:space="preserve">Incluir software en </w:t>
-            </w:r>
-            <w:proofErr w:type="spellStart"/>
-            <w:r>
+              <w:t>Incluir software en pedagogia</w:t>
+            </w:r>
+          </w:p>
+        </w:tc>
+      </w:tr>
+      <w:tr>
+        <w:trPr>
+          <w:trHeight w:val="300"/>
+        </w:trPr>
+        <w:tc>
+          <w:tcPr>
+            <w:tcW w:w="0" w:type="auto"/>
+            <w:vAlign w:val="center"/>
+          </w:tcPr>
+          <w:p>
+            <w:pPr>
+              <w:spacing w:after="0"/>
+              <w:jc w:val="center"/>
               <w:rPr>
                 <w:rFonts w:asciiTheme="majorHAnsi" w:hAnsiTheme="majorHAnsi" w:cstheme="majorHAnsi"/>
                 <w:color w:val="000000" w:themeColor="text1"/>
+              </w:rPr>
+            </w:pPr>
+            <w:r>
+              <w:rPr>
+                <w:rFonts w:asciiTheme="majorHAnsi" w:hAnsiTheme="majorHAnsi" w:cstheme="majorHAnsi"/>
+                <w:color w:val="000000" w:themeColor="text1"/>
+              </w:rPr>
+              <w:t>INFRAESTRUCTURA</w:t>
+            </w:r>
+          </w:p>
+        </w:tc>
+        <w:tc>
+          <w:tcPr>
+            <w:tcW w:w="0" w:type="auto"/>
+            <w:vAlign w:val="center"/>
+          </w:tcPr>
+          <w:p>
+            <w:pPr>
+              <w:spacing w:after="0" w:line="240" w:lineRule="auto"/>
+              <w:jc w:val="center"/>
+              <w:rPr>
+                <w:rFonts w:asciiTheme="majorHAnsi" w:hAnsiTheme="majorHAnsi" w:cstheme="majorHAnsi"/>
+                <w:color w:val="000000" w:themeColor="text1"/>
                 <w:lang w:bidi="es-ES"/>
               </w:rPr>
-              <w:t>pedagogia</w:t>
-            </w:r>
-            <w:proofErr w:type="spellEnd"/>
+            </w:pPr>
+            <w:r>
+              <w:rPr>
+                <w:rFonts w:asciiTheme="majorHAnsi" w:hAnsiTheme="majorHAnsi" w:cstheme="majorHAnsi"/>
+                <w:color w:val="000000" w:themeColor="text1"/>
+                <w:lang w:bidi="es-ES"/>
+              </w:rPr>
+              <w:t>TODAS</w:t>
+            </w:r>
+          </w:p>
+        </w:tc>
+        <w:tc>
+          <w:tcPr>
+            <w:tcW w:w="4627" w:type="dxa"/>
+            <w:vAlign w:val="center"/>
+          </w:tcPr>
+          <w:p>
+            <w:pPr>
+              <w:spacing w:after="0" w:line="240" w:lineRule="auto"/>
+              <w:jc w:val="both"/>
+              <w:rPr>
+                <w:rFonts w:asciiTheme="majorHAnsi" w:hAnsiTheme="majorHAnsi" w:cstheme="majorHAnsi"/>
+                <w:color w:val="000000" w:themeColor="text1"/>
+                <w:lang w:bidi="es-ES"/>
+              </w:rPr>
+            </w:pPr>
+            <w:r>
+              <w:rPr>
+                <w:rFonts w:asciiTheme="majorHAnsi" w:hAnsiTheme="majorHAnsi" w:cstheme="majorHAnsi"/>
+                <w:color w:val="000000" w:themeColor="text1"/>
+                <w:lang w:bidi="es-ES"/>
+              </w:rPr>
+              <w:t>Mejorar infraestructura</w:t>
+            </w:r>
           </w:p>
         </w:tc>
       </w:tr>
@@ -779,9 +845,8 @@
           <w:sz w:val="22"/>
           <w:szCs w:val="22"/>
         </w:rPr>
-        <w:t xml:space="preserve">En este contexto, </w:t>
-      </w:r>
-      <w:proofErr w:type="spellStart"/>
+        <w:t xml:space="preserve">En este contexto, DevNet se presenta como una iniciativa clave que integra el desarrollo de software con el conocimiento en redes, permitiendo a los profesionales automatizar tareas, </w:t>
+      </w:r>
       <w:r>
         <w:rPr>
           <w:rFonts w:asciiTheme="majorHAnsi" w:hAnsiTheme="majorHAnsi" w:cstheme="majorHAnsi"/>
@@ -789,9 +854,9 @@
           <w:sz w:val="22"/>
           <w:szCs w:val="22"/>
         </w:rPr>
-        <w:t>DevNet</w:t>
-      </w:r>
-      <w:proofErr w:type="spellEnd"/>
+        <w:lastRenderedPageBreak/>
+        <w:t>integrar sistemas, mejorar tiempos de respuesta ante incidentes y reducir la complejidad operativa en entornos de red híbridos (físicos y virtualizados)</w:t>
+      </w:r>
       <w:r>
         <w:rPr>
           <w:rFonts w:asciiTheme="majorHAnsi" w:hAnsiTheme="majorHAnsi" w:cstheme="majorHAnsi"/>
@@ -799,7 +864,7 @@
           <w:sz w:val="22"/>
           <w:szCs w:val="22"/>
         </w:rPr>
-        <w:t xml:space="preserve"> se presenta como una iniciativa clave que integra el desarrollo de software con el conocimiento en redes, permitiendo a los profesionales automatizar tareas, integrar sistemas, mejorar tiempos de respuesta ante incidentes y reducir la complejidad </w:t>
+        <w:t xml:space="preserve">, avanzando así </w:t>
       </w:r>
       <w:r>
         <w:rPr>
@@ -808,9 +873,19 @@
           <w:sz w:val="22"/>
           <w:szCs w:val="22"/>
         </w:rPr>
-        <w:lastRenderedPageBreak/>
-        <w:t>operativa en entornos de red híbridos (físicos y virtualizados)</w:t>
-      </w:r>
+        <w:t>hacia modelos de operación más ágiles, escalables y sostenibles en sectores como educación, salud, agricultura, industria y administración pública.</w:t>
+      </w:r>
+    </w:p>
+    <w:p>
+      <w:pPr>
+        <w:pStyle w:val="NormalWeb"/>
+        <w:jc w:val="both"/>
+        <w:rPr>
+          <w:rFonts w:asciiTheme="majorHAnsi" w:hAnsiTheme="majorHAnsi" w:cstheme="majorHAnsi"/>
+          <w:b/>
+          <w:bCs/>
+        </w:rPr>
+      </w:pPr>
       <w:r>
         <w:rPr>
           <w:rFonts w:asciiTheme="majorHAnsi" w:hAnsiTheme="majorHAnsi" w:cstheme="majorHAnsi"/>
@@ -818,7 +893,7 @@
           <w:sz w:val="22"/>
           <w:szCs w:val="22"/>
         </w:rPr>
-        <w:t xml:space="preserve">, avanzando así </w:t>
+        <w:t>Por lo anterior,</w:t>
       </w:r>
       <w:r>
         <w:rPr>
@@ -827,140 +902,99 @@
           <w:sz w:val="22"/>
           <w:szCs w:val="22"/>
         </w:rPr>
-        <w:t>hacia modelos de operación más ágiles, escalables y sostenibles en sectores como educación, salud, agricultura, industria y administración pública.</w:t>
-      </w:r>
-    </w:p>
-    <w:p>
-      <w:pPr>
-        <w:pStyle w:val="NormalWeb"/>
-        <w:jc w:val="both"/>
+        <w:t xml:space="preserve"> </w:t>
+      </w:r>
+      <w:r>
+        <w:rPr>
+          <w:rFonts w:asciiTheme="majorHAnsi" w:hAnsiTheme="majorHAnsi" w:cstheme="majorHAnsi"/>
+          <w:color w:val="000000" w:themeColor="text1"/>
+          <w:sz w:val="22"/>
+          <w:szCs w:val="22"/>
+        </w:rPr>
+        <w:t>l</w:t>
+      </w:r>
+      <w:r>
+        <w:rPr>
+          <w:rFonts w:asciiTheme="majorHAnsi" w:hAnsiTheme="majorHAnsi" w:cstheme="majorHAnsi"/>
+          <w:color w:val="000000" w:themeColor="text1"/>
+          <w:sz w:val="22"/>
+          <w:szCs w:val="22"/>
+        </w:rPr>
+        <w:t>a Dirección de Formación Profesional (DFP)</w:t>
+      </w:r>
+      <w:r>
+        <w:rPr>
+          <w:rStyle w:val="Refdenotaalpie"/>
+          <w:rFonts w:asciiTheme="majorHAnsi" w:hAnsiTheme="majorHAnsi" w:cstheme="majorHAnsi"/>
+          <w:color w:val="000000" w:themeColor="text1"/>
+          <w:sz w:val="22"/>
+          <w:szCs w:val="22"/>
+        </w:rPr>
+        <w:t xml:space="preserve"> </w:t>
+      </w:r>
+      <w:r>
+        <w:rPr>
+          <w:rStyle w:val="Refdenotaalpie"/>
+          <w:rFonts w:asciiTheme="majorHAnsi" w:hAnsiTheme="majorHAnsi" w:cstheme="majorHAnsi"/>
+          <w:color w:val="000000" w:themeColor="text1"/>
+          <w:sz w:val="22"/>
+          <w:szCs w:val="22"/>
+        </w:rPr>
+        <w:footnoteReference w:id="1"/>
+      </w:r>
+      <w:r>
+        <w:rPr>
+          <w:rFonts w:asciiTheme="majorHAnsi" w:hAnsiTheme="majorHAnsi" w:cstheme="majorHAnsi"/>
+          <w:color w:val="000000" w:themeColor="text1"/>
+          <w:sz w:val="22"/>
+          <w:szCs w:val="22"/>
+        </w:rPr>
+        <w:t xml:space="preserve"> en desarrollo de sus objetivos y propósitos, dirigidos a la permanente actualización y desarrollo de competencias que implican un avance en las capacidades y habilidades técnicas de los instructores en la institución, abre </w:t>
+      </w:r>
+      <w:r>
+        <w:rPr>
+          <w:rFonts w:asciiTheme="majorHAnsi" w:hAnsiTheme="majorHAnsi" w:cstheme="majorHAnsi"/>
+          <w:color w:val="000000" w:themeColor="text1"/>
+          <w:sz w:val="22"/>
+          <w:szCs w:val="22"/>
+        </w:rPr>
+        <w:t>la</w:t>
+      </w:r>
+      <w:r>
+        <w:rPr>
+          <w:rFonts w:asciiTheme="majorHAnsi" w:hAnsiTheme="majorHAnsi" w:cstheme="majorHAnsi"/>
+          <w:color w:val="000000" w:themeColor="text1"/>
+          <w:sz w:val="22"/>
+          <w:szCs w:val="22"/>
+        </w:rPr>
+        <w:t xml:space="preserve"> convocatoria</w:t>
+      </w:r>
+      <w:r>
+        <w:rPr>
+          <w:rFonts w:asciiTheme="majorHAnsi" w:hAnsiTheme="majorHAnsi" w:cstheme="majorHAnsi"/>
+          <w:color w:val="000000" w:themeColor="text1"/>
+          <w:sz w:val="22"/>
+          <w:szCs w:val="22"/>
+        </w:rPr>
+        <w:t xml:space="preserve"> </w:t>
+      </w:r>
+      <w:r>
         <w:rPr>
           <w:rFonts w:asciiTheme="majorHAnsi" w:hAnsiTheme="majorHAnsi" w:cstheme="majorHAnsi"/>
           <w:b/>
           <w:bCs/>
         </w:rPr>
-      </w:pPr>
-      <w:r>
-        <w:rPr>
-          <w:rFonts w:asciiTheme="majorHAnsi" w:hAnsiTheme="majorHAnsi" w:cstheme="majorHAnsi"/>
-          <w:color w:val="000000" w:themeColor="text1"/>
-          <w:sz w:val="22"/>
-          <w:szCs w:val="22"/>
-        </w:rPr>
-        <w:t>Por lo anterior,</w:t>
-      </w:r>
-      <w:r>
-        <w:rPr>
-          <w:rFonts w:asciiTheme="majorHAnsi" w:hAnsiTheme="majorHAnsi" w:cstheme="majorHAnsi"/>
-          <w:color w:val="000000" w:themeColor="text1"/>
-          <w:sz w:val="22"/>
-          <w:szCs w:val="22"/>
-        </w:rPr>
-        <w:t xml:space="preserve"> </w:t>
-      </w:r>
-      <w:r>
-        <w:rPr>
-          <w:rFonts w:asciiTheme="majorHAnsi" w:hAnsiTheme="majorHAnsi" w:cstheme="majorHAnsi"/>
-          <w:color w:val="000000" w:themeColor="text1"/>
-          <w:sz w:val="22"/>
-          <w:szCs w:val="22"/>
-        </w:rPr>
-        <w:t>l</w:t>
-      </w:r>
-      <w:r>
-        <w:rPr>
-          <w:rFonts w:asciiTheme="majorHAnsi" w:hAnsiTheme="majorHAnsi" w:cstheme="majorHAnsi"/>
-          <w:color w:val="000000" w:themeColor="text1"/>
-          <w:sz w:val="22"/>
-          <w:szCs w:val="22"/>
-        </w:rPr>
-        <w:t>a Dirección de Formación Profesional (DFP)</w:t>
-      </w:r>
-      <w:r>
-        <w:rPr>
-          <w:rStyle w:val="Refdenotaalpie"/>
-          <w:rFonts w:asciiTheme="majorHAnsi" w:hAnsiTheme="majorHAnsi" w:cstheme="majorHAnsi"/>
-          <w:color w:val="000000" w:themeColor="text1"/>
-          <w:sz w:val="22"/>
-          <w:szCs w:val="22"/>
-        </w:rPr>
-        <w:t xml:space="preserve"> </w:t>
-      </w:r>
-      <w:r>
-        <w:rPr>
-          <w:rStyle w:val="Refdenotaalpie"/>
-          <w:rFonts w:asciiTheme="majorHAnsi" w:hAnsiTheme="majorHAnsi" w:cstheme="majorHAnsi"/>
-          <w:color w:val="000000" w:themeColor="text1"/>
-          <w:sz w:val="22"/>
-          <w:szCs w:val="22"/>
-        </w:rPr>
-        <w:footnoteReference w:id="1"/>
-      </w:r>
-      <w:r>
-        <w:rPr>
-          <w:rFonts w:asciiTheme="majorHAnsi" w:hAnsiTheme="majorHAnsi" w:cstheme="majorHAnsi"/>
-          <w:color w:val="000000" w:themeColor="text1"/>
-          <w:sz w:val="22"/>
-          <w:szCs w:val="22"/>
-        </w:rPr>
-        <w:t xml:space="preserve"> en desarrollo de sus objetivos y propósitos, dirigidos a la permanente actualización y desarrollo de competencias que implican un avance en las capacidades y habilidades técnicas de los instructores en la institución, abre </w:t>
-      </w:r>
-      <w:r>
-        <w:rPr>
-          <w:rFonts w:asciiTheme="majorHAnsi" w:hAnsiTheme="majorHAnsi" w:cstheme="majorHAnsi"/>
-          <w:color w:val="000000" w:themeColor="text1"/>
-          <w:sz w:val="22"/>
-          <w:szCs w:val="22"/>
-        </w:rPr>
-        <w:t>la</w:t>
-      </w:r>
-      <w:r>
-        <w:rPr>
-          <w:rFonts w:asciiTheme="majorHAnsi" w:hAnsiTheme="majorHAnsi" w:cstheme="majorHAnsi"/>
-          <w:color w:val="000000" w:themeColor="text1"/>
-          <w:sz w:val="22"/>
-          <w:szCs w:val="22"/>
-        </w:rPr>
-        <w:t xml:space="preserve"> convocatoria</w:t>
-      </w:r>
-      <w:r>
-        <w:rPr>
-          <w:rFonts w:asciiTheme="majorHAnsi" w:hAnsiTheme="majorHAnsi" w:cstheme="majorHAnsi"/>
-          <w:color w:val="000000" w:themeColor="text1"/>
-          <w:sz w:val="22"/>
-          <w:szCs w:val="22"/>
-        </w:rPr>
-        <w:t xml:space="preserve"> </w:t>
+        <w:t>“</w:t>
       </w:r>
       <w:r>
         <w:rPr>
           <w:rFonts w:asciiTheme="majorHAnsi" w:hAnsiTheme="majorHAnsi" w:cstheme="majorHAnsi"/>
           <w:b/>
           <w:bCs/>
-        </w:rPr>
-        <w:t>“</w:t>
-      </w:r>
-      <w:proofErr w:type="spellStart"/>
-      <w:r>
-        <w:rPr>
-          <w:rFonts w:asciiTheme="majorHAnsi" w:hAnsiTheme="majorHAnsi" w:cstheme="majorHAnsi"/>
-          <w:b/>
-          <w:bCs/>
           <w:color w:val="000000" w:themeColor="text1"/>
           <w:lang w:eastAsia="es-ES"/>
         </w:rPr>
-        <w:t>DevNet</w:t>
-      </w:r>
-      <w:proofErr w:type="spellEnd"/>
-      <w:r>
-        <w:rPr>
-          <w:rFonts w:asciiTheme="majorHAnsi" w:hAnsiTheme="majorHAnsi" w:cstheme="majorHAnsi"/>
-          <w:b/>
-          <w:bCs/>
-          <w:color w:val="000000" w:themeColor="text1"/>
-          <w:lang w:eastAsia="es-ES"/>
-        </w:rPr>
-        <w:t>: Desarrollo de Software para la Automatización de Redes Nivel Básico</w:t>
+        <w:t>DevNet: Desarrollo de Software para la Automatización de Redes Nivel Básico</w:t>
       </w:r>
       <w:r>
         <w:rPr>
@@ -2429,20 +2463,8 @@
                 <w:sz w:val="18"/>
                 <w:szCs w:val="18"/>
               </w:rPr>
-              <w:t xml:space="preserve"> al curso </w:t>
-            </w:r>
-            <w:proofErr w:type="spellStart"/>
-            <w:r>
-              <w:rPr>
-                <w:rFonts w:eastAsiaTheme="minorEastAsia"/>
-                <w:bCs/>
-                <w:color w:val="000000" w:themeColor="text1"/>
-                <w:sz w:val="18"/>
-                <w:szCs w:val="18"/>
-              </w:rPr>
-              <w:t>DevNet</w:t>
-            </w:r>
-            <w:proofErr w:type="spellEnd"/>
+              <w:t xml:space="preserve"> al curso DevNet</w:t>
+            </w:r>
           </w:p>
           <w:p>
             <w:pPr>
@@ -2466,20 +2488,8 @@
                 <w:sz w:val="18"/>
                 <w:szCs w:val="18"/>
               </w:rPr>
-              <w:t xml:space="preserve">Módulo 2 Entorno de desarrolladores de </w:t>
-            </w:r>
-            <w:proofErr w:type="spellStart"/>
-            <w:r>
-              <w:rPr>
-                <w:rFonts w:eastAsiaTheme="minorEastAsia"/>
-                <w:bCs/>
-                <w:color w:val="000000" w:themeColor="text1"/>
-                <w:sz w:val="18"/>
-                <w:szCs w:val="18"/>
-              </w:rPr>
-              <w:t>DevNet</w:t>
-            </w:r>
-            <w:proofErr w:type="spellEnd"/>
+              <w:t>Módulo 2 Entorno de desarrolladores de DevNet</w:t>
+            </w:r>
           </w:p>
           <w:p>
             <w:pPr>
@@ -2528,42 +2538,8 @@
                 <w:sz w:val="18"/>
                 <w:szCs w:val="18"/>
               </w:rPr>
-              <w:t xml:space="preserve">1.2.2 </w:t>
-            </w:r>
-            <w:proofErr w:type="spellStart"/>
-            <w:r>
-              <w:rPr>
-                <w:rFonts w:eastAsiaTheme="minorEastAsia"/>
-                <w:bCs/>
-                <w:color w:val="000000" w:themeColor="text1"/>
-                <w:sz w:val="18"/>
-                <w:szCs w:val="18"/>
-              </w:rPr>
-              <w:t>Lab</w:t>
-            </w:r>
-            <w:proofErr w:type="spellEnd"/>
-            <w:r>
-              <w:rPr>
-                <w:rFonts w:eastAsiaTheme="minorEastAsia"/>
-                <w:bCs/>
-                <w:color w:val="000000" w:themeColor="text1"/>
-                <w:sz w:val="18"/>
-                <w:szCs w:val="18"/>
-              </w:rPr>
-              <w:t xml:space="preserve"> - Linux </w:t>
-            </w:r>
-            <w:proofErr w:type="spellStart"/>
-            <w:r>
-              <w:rPr>
-                <w:rFonts w:eastAsiaTheme="minorEastAsia"/>
-                <w:bCs/>
-                <w:color w:val="000000" w:themeColor="text1"/>
-                <w:sz w:val="18"/>
-                <w:szCs w:val="18"/>
-              </w:rPr>
-              <w:t>Review</w:t>
-            </w:r>
-            <w:proofErr w:type="spellEnd"/>
+              <w:t>1.2.2 Lab - Linux Review</w:t>
+            </w:r>
           </w:p>
         </w:tc>
       </w:tr>
@@ -3210,7 +3186,6 @@
               </w:rPr>
               <w:t xml:space="preserve">Examen del </w:t>
             </w:r>
-            <w:proofErr w:type="spellStart"/>
             <w:r>
               <w:rPr>
                 <w:rFonts w:eastAsiaTheme="minorEastAsia"/>
@@ -3220,19 +3195,7 @@
                 <w:szCs w:val="18"/>
                 <w:lang w:val="en-US"/>
               </w:rPr>
-              <w:t>módulo</w:t>
-            </w:r>
-            <w:proofErr w:type="spellEnd"/>
-            <w:r>
-              <w:rPr>
-                <w:rFonts w:eastAsiaTheme="minorEastAsia"/>
-                <w:bCs/>
-                <w:color w:val="000000" w:themeColor="text1"/>
-                <w:sz w:val="18"/>
-                <w:szCs w:val="18"/>
-                <w:lang w:val="en-US"/>
-              </w:rPr>
-              <w:t xml:space="preserve"> 1 y 2</w:t>
+              <w:t>módulo 1 y 2</w:t>
             </w:r>
           </w:p>
         </w:tc>
@@ -3641,7 +3604,6 @@
               </w:rPr>
               <w:t xml:space="preserve">Examen del </w:t>
             </w:r>
-            <w:proofErr w:type="spellStart"/>
             <w:r>
               <w:rPr>
                 <w:rFonts w:eastAsiaTheme="minorEastAsia"/>
@@ -3651,19 +3613,7 @@
                 <w:szCs w:val="18"/>
                 <w:lang w:val="en-US"/>
               </w:rPr>
-              <w:t>módulo</w:t>
-            </w:r>
-            <w:proofErr w:type="spellEnd"/>
-            <w:r>
-              <w:rPr>
-                <w:rFonts w:eastAsiaTheme="minorEastAsia"/>
-                <w:bCs/>
-                <w:color w:val="000000" w:themeColor="text1"/>
-                <w:sz w:val="18"/>
-                <w:szCs w:val="18"/>
-                <w:lang w:val="en-US"/>
-              </w:rPr>
-              <w:t xml:space="preserve"> 3</w:t>
+              <w:t>módulo 3</w:t>
             </w:r>
           </w:p>
         </w:tc>
@@ -4152,7 +4102,6 @@
               </w:rPr>
               <w:t xml:space="preserve">Examen del </w:t>
             </w:r>
-            <w:proofErr w:type="spellStart"/>
             <w:r>
               <w:rPr>
                 <w:rFonts w:eastAsiaTheme="minorEastAsia"/>
@@ -4162,19 +4111,7 @@
                 <w:szCs w:val="18"/>
                 <w:lang w:val="en-US"/>
               </w:rPr>
-              <w:t>módulo</w:t>
-            </w:r>
-            <w:proofErr w:type="spellEnd"/>
-            <w:r>
-              <w:rPr>
-                <w:rFonts w:eastAsiaTheme="minorEastAsia"/>
-                <w:bCs/>
-                <w:color w:val="000000" w:themeColor="text1"/>
-                <w:sz w:val="18"/>
-                <w:szCs w:val="18"/>
-                <w:lang w:val="en-US"/>
-              </w:rPr>
-              <w:t xml:space="preserve"> 4</w:t>
+              <w:t>módulo 4</w:t>
             </w:r>
           </w:p>
         </w:tc>
@@ -4756,7 +4693,6 @@
               </w:rPr>
               <w:t xml:space="preserve">Examen del </w:t>
             </w:r>
-            <w:proofErr w:type="spellStart"/>
             <w:r>
               <w:rPr>
                 <w:rFonts w:eastAsiaTheme="minorEastAsia"/>
@@ -4766,19 +4702,7 @@
                 <w:szCs w:val="18"/>
                 <w:lang w:val="en-US"/>
               </w:rPr>
-              <w:t>módulo</w:t>
-            </w:r>
-            <w:proofErr w:type="spellEnd"/>
-            <w:r>
-              <w:rPr>
-                <w:rFonts w:eastAsiaTheme="minorEastAsia"/>
-                <w:bCs/>
-                <w:color w:val="000000" w:themeColor="text1"/>
-                <w:sz w:val="18"/>
-                <w:szCs w:val="18"/>
-                <w:lang w:val="en-US"/>
-              </w:rPr>
-              <w:t xml:space="preserve"> 5</w:t>
+              <w:t>módulo 5</w:t>
             </w:r>
           </w:p>
         </w:tc>
@@ -4976,73 +4900,7 @@
                 <w:sz w:val="18"/>
                 <w:szCs w:val="18"/>
               </w:rPr>
-              <w:t xml:space="preserve">7.0.3 </w:t>
-            </w:r>
-            <w:proofErr w:type="spellStart"/>
-            <w:r>
-              <w:rPr>
-                <w:rFonts w:eastAsiaTheme="minorEastAsia"/>
-                <w:bCs/>
-                <w:color w:val="000000" w:themeColor="text1"/>
-                <w:sz w:val="18"/>
-                <w:szCs w:val="18"/>
-              </w:rPr>
-              <w:t>Lab</w:t>
-            </w:r>
-            <w:proofErr w:type="spellEnd"/>
-            <w:r>
-              <w:rPr>
-                <w:rFonts w:eastAsiaTheme="minorEastAsia"/>
-                <w:bCs/>
-                <w:color w:val="000000" w:themeColor="text1"/>
-                <w:sz w:val="18"/>
-                <w:szCs w:val="18"/>
-              </w:rPr>
-              <w:t xml:space="preserve"> - </w:t>
-            </w:r>
-            <w:proofErr w:type="spellStart"/>
-            <w:r>
-              <w:rPr>
-                <w:rFonts w:eastAsiaTheme="minorEastAsia"/>
-                <w:bCs/>
-                <w:color w:val="000000" w:themeColor="text1"/>
-                <w:sz w:val="18"/>
-                <w:szCs w:val="18"/>
-              </w:rPr>
-              <w:t>Install</w:t>
-            </w:r>
-            <w:proofErr w:type="spellEnd"/>
-            <w:r>
-              <w:rPr>
-                <w:rFonts w:eastAsiaTheme="minorEastAsia"/>
-                <w:bCs/>
-                <w:color w:val="000000" w:themeColor="text1"/>
-                <w:sz w:val="18"/>
-                <w:szCs w:val="18"/>
-              </w:rPr>
-              <w:t xml:space="preserve"> </w:t>
-            </w:r>
-            <w:proofErr w:type="spellStart"/>
-            <w:r>
-              <w:rPr>
-                <w:rFonts w:eastAsiaTheme="minorEastAsia"/>
-                <w:bCs/>
-                <w:color w:val="000000" w:themeColor="text1"/>
-                <w:sz w:val="18"/>
-                <w:szCs w:val="18"/>
-              </w:rPr>
-              <w:t>the</w:t>
-            </w:r>
-            <w:proofErr w:type="spellEnd"/>
-            <w:r>
-              <w:rPr>
-                <w:rFonts w:eastAsiaTheme="minorEastAsia"/>
-                <w:bCs/>
-                <w:color w:val="000000" w:themeColor="text1"/>
-                <w:sz w:val="18"/>
-                <w:szCs w:val="18"/>
-              </w:rPr>
-              <w:t xml:space="preserve"> CSR1000v VM </w:t>
+              <w:t xml:space="preserve">7.0.3 Lab - Install the CSR1000v VM </w:t>
             </w:r>
           </w:p>
           <w:p>
@@ -5123,31 +4981,7 @@
                 <w:szCs w:val="18"/>
                 <w:lang w:val="en-US"/>
               </w:rPr>
-              <w:t xml:space="preserve">7.6.3 Lab - Automated Testing Using </w:t>
-            </w:r>
-            <w:proofErr w:type="spellStart"/>
-            <w:r>
-              <w:rPr>
-                <w:rFonts w:eastAsiaTheme="minorEastAsia"/>
-                <w:bCs/>
-                <w:color w:val="000000" w:themeColor="text1"/>
-                <w:sz w:val="18"/>
-                <w:szCs w:val="18"/>
-                <w:lang w:val="en-US"/>
-              </w:rPr>
-              <w:t>pyATS</w:t>
-            </w:r>
-            <w:proofErr w:type="spellEnd"/>
-            <w:r>
-              <w:rPr>
-                <w:rFonts w:eastAsiaTheme="minorEastAsia"/>
-                <w:bCs/>
-                <w:color w:val="000000" w:themeColor="text1"/>
-                <w:sz w:val="18"/>
-                <w:szCs w:val="18"/>
-                <w:lang w:val="en-US"/>
-              </w:rPr>
-              <w:t xml:space="preserve"> and Genie</w:t>
+              <w:t>7.6.3 Lab - Automated Testing Using pyATS and Genie</w:t>
             </w:r>
           </w:p>
           <w:p>
@@ -5176,7 +5010,6 @@
               </w:rPr>
               <w:t xml:space="preserve">Examen del </w:t>
             </w:r>
-            <w:proofErr w:type="spellStart"/>
             <w:r>
               <w:rPr>
                 <w:rFonts w:eastAsiaTheme="minorEastAsia"/>
@@ -5186,19 +5019,7 @@
                 <w:szCs w:val="18"/>
                 <w:lang w:val="en-US"/>
               </w:rPr>
-              <w:t>módulo</w:t>
-            </w:r>
-            <w:proofErr w:type="spellEnd"/>
-            <w:r>
-              <w:rPr>
-                <w:rFonts w:eastAsiaTheme="minorEastAsia"/>
-                <w:bCs/>
-                <w:color w:val="000000" w:themeColor="text1"/>
-                <w:sz w:val="18"/>
-                <w:szCs w:val="18"/>
-                <w:lang w:val="en-US"/>
-              </w:rPr>
-              <w:t xml:space="preserve"> 6</w:t>
+              <w:t>módulo 6</w:t>
             </w:r>
           </w:p>
         </w:tc>
@@ -5493,7 +5314,6 @@
               </w:rPr>
               <w:t xml:space="preserve">Examen del </w:t>
             </w:r>
-            <w:proofErr w:type="spellStart"/>
             <w:r>
               <w:rPr>
                 <w:rFonts w:eastAsiaTheme="minorEastAsia"/>
@@ -5503,19 +5323,7 @@
                 <w:szCs w:val="18"/>
                 <w:lang w:val="en-US"/>
               </w:rPr>
-              <w:t>módulo</w:t>
-            </w:r>
-            <w:proofErr w:type="spellEnd"/>
-            <w:r>
-              <w:rPr>
-                <w:rFonts w:eastAsiaTheme="minorEastAsia"/>
-                <w:bCs/>
-                <w:color w:val="000000" w:themeColor="text1"/>
-                <w:sz w:val="18"/>
-                <w:szCs w:val="18"/>
-                <w:lang w:val="en-US"/>
-              </w:rPr>
-              <w:t xml:space="preserve"> 7</w:t>
+              <w:t>módulo 7</w:t>
             </w:r>
           </w:p>
         </w:tc>
@@ -5721,42 +5529,8 @@
                 <w:sz w:val="18"/>
                 <w:szCs w:val="18"/>
               </w:rPr>
-              <w:t xml:space="preserve">8 Desarrollo y Plataformas de </w:t>
-            </w:r>
-            <w:proofErr w:type="spellStart"/>
-            <w:r>
-              <w:rPr>
-                <w:rFonts w:eastAsiaTheme="minorEastAsia"/>
-                <w:bCs/>
-                <w:color w:val="000000" w:themeColor="text1"/>
-                <w:sz w:val="18"/>
-                <w:szCs w:val="18"/>
-              </w:rPr>
-              <w:t>CiscoExternal</w:t>
-            </w:r>
-            <w:proofErr w:type="spellEnd"/>
-            <w:r>
-              <w:rPr>
-                <w:rFonts w:eastAsiaTheme="minorEastAsia"/>
-                <w:bCs/>
-                <w:color w:val="000000" w:themeColor="text1"/>
-                <w:sz w:val="18"/>
-                <w:szCs w:val="18"/>
-              </w:rPr>
-              <w:t xml:space="preserve"> </w:t>
-            </w:r>
-            <w:proofErr w:type="spellStart"/>
-            <w:r>
-              <w:rPr>
-                <w:rFonts w:eastAsiaTheme="minorEastAsia"/>
-                <w:bCs/>
-                <w:color w:val="000000" w:themeColor="text1"/>
-                <w:sz w:val="18"/>
-                <w:szCs w:val="18"/>
-              </w:rPr>
-              <w:t>tool</w:t>
-            </w:r>
-            <w:proofErr w:type="spellEnd"/>
+              <w:t>8 Desarrollo y Plataformas de CiscoExternal tool</w:t>
+            </w:r>
           </w:p>
           <w:p>
             <w:pPr>
@@ -5861,7 +5635,6 @@
               </w:rPr>
               <w:t xml:space="preserve">Examen del </w:t>
             </w:r>
-            <w:proofErr w:type="spellStart"/>
             <w:r>
               <w:rPr>
                 <w:rFonts w:eastAsiaTheme="minorEastAsia"/>
@@ -5871,19 +5644,7 @@
                 <w:szCs w:val="18"/>
                 <w:lang w:val="en-US"/>
               </w:rPr>
-              <w:t>módulo</w:t>
-            </w:r>
-            <w:proofErr w:type="spellEnd"/>
-            <w:r>
-              <w:rPr>
-                <w:rFonts w:eastAsiaTheme="minorEastAsia"/>
-                <w:bCs/>
-                <w:color w:val="000000" w:themeColor="text1"/>
-                <w:sz w:val="18"/>
-                <w:szCs w:val="18"/>
-                <w:lang w:val="en-US"/>
-              </w:rPr>
-              <w:t xml:space="preserve"> 8</w:t>
+              <w:t>módulo 8</w:t>
             </w:r>
           </w:p>
         </w:tc>
@@ -6320,21 +6081,7 @@
         <w:rPr>
           <w:bCs/>
         </w:rPr>
-        <w:t xml:space="preserve">y Certificación en plataforma de Cisco </w:t>
-      </w:r>
-      <w:proofErr w:type="spellStart"/>
-      <w:r>
-        <w:rPr>
-          <w:bCs/>
-        </w:rPr>
-        <w:t>Netacad</w:t>
-      </w:r>
-      <w:proofErr w:type="spellEnd"/>
-      <w:r>
-        <w:rPr>
-          <w:bCs/>
-        </w:rPr>
-        <w:t xml:space="preserve"> </w:t>
+        <w:t xml:space="preserve">y Certificación en plataforma de Cisco Netacad </w:t>
       </w:r>
     </w:p>
     <w:p>
@@ -7101,7 +6848,6 @@
                 <w:color w:val="000000" w:themeColor="text1"/>
               </w:rPr>
             </w:pPr>
-            <w:proofErr w:type="spellStart"/>
             <w:r>
               <w:rPr>
                 <w:rFonts w:asciiTheme="majorHAnsi" w:hAnsiTheme="majorHAnsi" w:cstheme="majorHAnsi"/>
@@ -7110,7 +6856,6 @@
               </w:rPr>
               <w:t>Teams</w:t>
             </w:r>
-            <w:proofErr w:type="spellEnd"/>
             <w:r>
               <w:rPr>
                 <w:rFonts w:asciiTheme="majorHAnsi" w:hAnsiTheme="majorHAnsi" w:cstheme="majorHAnsi"/>
@@ -7127,23 +6872,13 @@
               </w:rPr>
               <w:t xml:space="preserve"> </w:t>
             </w:r>
-            <w:proofErr w:type="spellStart"/>
             <w:r>
               <w:rPr>
                 <w:rFonts w:asciiTheme="majorHAnsi" w:hAnsiTheme="majorHAnsi" w:cstheme="majorHAnsi"/>
                 <w:bCs/>
                 <w:color w:val="000000" w:themeColor="text1"/>
               </w:rPr>
-              <w:t>Webex</w:t>
-            </w:r>
-            <w:proofErr w:type="spellEnd"/>
-            <w:r>
-              <w:rPr>
-                <w:rFonts w:asciiTheme="majorHAnsi" w:hAnsiTheme="majorHAnsi" w:cstheme="majorHAnsi"/>
-                <w:bCs/>
-                <w:color w:val="000000" w:themeColor="text1"/>
-              </w:rPr>
-              <w:t xml:space="preserve"> </w:t>
+              <w:t xml:space="preserve">Webex </w:t>
             </w:r>
             <w:r>
               <w:rPr>
@@ -8203,21 +7938,13 @@
           <w:b/>
           <w:bCs/>
         </w:rPr>
-        <w:t xml:space="preserve">, 21730061         FUNDAMENTOS DE PROGRAMACIÓN  60 </w:t>
-      </w:r>
-      <w:proofErr w:type="gramStart"/>
+        <w:t>, 21730061         FUNDAMENTOS DE PROGRAMACIÓN  60 horas</w:t>
+      </w:r>
       <w:r>
         <w:rPr>
           <w:b/>
           <w:bCs/>
         </w:rPr>
-        <w:t>horas</w:t>
-      </w:r>
-      <w:r>
-        <w:rPr>
-          <w:b/>
-          <w:bCs/>
-        </w:rPr>
         <w:t xml:space="preserve"> </w:t>
       </w:r>
       <w:r>
@@ -8234,7 +7961,6 @@
         </w:rPr>
         <w:t>ara</w:t>
       </w:r>
-      <w:proofErr w:type="gramEnd"/>
       <w:r>
         <w:rPr>
           <w:rFonts w:asciiTheme="majorHAnsi" w:hAnsiTheme="majorHAnsi" w:cstheme="majorHAnsi"/>
@@ -8907,21 +8633,12 @@
         </w:rPr>
         <w:tab/>
       </w:r>
-      <w:proofErr w:type="spellStart"/>
-      <w:r>
-        <w:rPr>
-          <w:rFonts w:asciiTheme="majorHAnsi" w:hAnsiTheme="majorHAnsi" w:cstheme="majorHAnsi"/>
-          <w:color w:val="000000" w:themeColor="text1"/>
-        </w:rPr>
-        <w:t>CC_No</w:t>
-      </w:r>
-      <w:proofErr w:type="spellEnd"/>
-      <w:r>
-        <w:rPr>
-          <w:rFonts w:asciiTheme="majorHAnsi" w:hAnsiTheme="majorHAnsi" w:cstheme="majorHAnsi"/>
-          <w:color w:val="000000" w:themeColor="text1"/>
-        </w:rPr>
-        <w:t>. CÉDULA _Nombre del instructor Ejemplo: CC_12345678_ Jaime López</w:t>
+      <w:r>
+        <w:rPr>
+          <w:rFonts w:asciiTheme="majorHAnsi" w:hAnsiTheme="majorHAnsi" w:cstheme="majorHAnsi"/>
+          <w:color w:val="000000" w:themeColor="text1"/>
+        </w:rPr>
+        <w:t>CC_No. CÉDULA _Nombre del instructor Ejemplo: CC_12345678_ Jaime López</w:t>
       </w:r>
     </w:p>
     <w:p>
@@ -8969,46 +8686,12 @@
         </w:rPr>
         <w:tab/>
       </w:r>
-      <w:proofErr w:type="spellStart"/>
-      <w:r>
-        <w:rPr>
-          <w:rFonts w:asciiTheme="majorHAnsi" w:hAnsiTheme="majorHAnsi" w:cstheme="majorHAnsi"/>
-          <w:color w:val="000000" w:themeColor="text1"/>
-        </w:rPr>
-        <w:t>ACTA_CC_</w:t>
-      </w:r>
-      <w:proofErr w:type="gramStart"/>
-      <w:r>
-        <w:rPr>
-          <w:rFonts w:asciiTheme="majorHAnsi" w:hAnsiTheme="majorHAnsi" w:cstheme="majorHAnsi"/>
-          <w:color w:val="000000" w:themeColor="text1"/>
-        </w:rPr>
-        <w:t>No.CÉDULA</w:t>
-      </w:r>
-      <w:proofErr w:type="spellEnd"/>
-      <w:proofErr w:type="gramEnd"/>
-      <w:r>
-        <w:rPr>
-          <w:rFonts w:asciiTheme="majorHAnsi" w:hAnsiTheme="majorHAnsi" w:cstheme="majorHAnsi"/>
-          <w:color w:val="000000" w:themeColor="text1"/>
-        </w:rPr>
-        <w:t xml:space="preserve"> _Jaime López (</w:t>
-      </w:r>
-      <w:proofErr w:type="gramStart"/>
-      <w:r>
-        <w:rPr>
-          <w:rFonts w:asciiTheme="majorHAnsi" w:hAnsiTheme="majorHAnsi" w:cstheme="majorHAnsi"/>
-          <w:color w:val="000000" w:themeColor="text1"/>
-        </w:rPr>
-        <w:t>PDF)  Ejemplo</w:t>
-      </w:r>
-      <w:proofErr w:type="gramEnd"/>
-      <w:r>
-        <w:rPr>
-          <w:rFonts w:asciiTheme="majorHAnsi" w:hAnsiTheme="majorHAnsi" w:cstheme="majorHAnsi"/>
-          <w:color w:val="000000" w:themeColor="text1"/>
-        </w:rPr>
-        <w:t>: ACTA_CC_12345678_ Jaime López</w:t>
+      <w:r>
+        <w:rPr>
+          <w:rFonts w:asciiTheme="majorHAnsi" w:hAnsiTheme="majorHAnsi" w:cstheme="majorHAnsi"/>
+          <w:color w:val="000000" w:themeColor="text1"/>
+        </w:rPr>
+        <w:t>ACTA_CC_No.CÉDULA _Jaime López (PDF)  Ejemplo: ACTA_CC_12345678_ Jaime López</w:t>
       </w:r>
     </w:p>
     <w:p>
@@ -10831,21 +10514,12 @@
         </w:rPr>
         <w:t xml:space="preserve"> </w:t>
       </w:r>
-      <w:proofErr w:type="spellStart"/>
-      <w:r>
-        <w:rPr>
-          <w:rFonts w:asciiTheme="majorHAnsi" w:hAnsiTheme="majorHAnsi" w:cstheme="majorHAnsi"/>
-          <w:color w:val="000000" w:themeColor="text1"/>
-        </w:rPr>
-        <w:t>CompromISO</w:t>
-      </w:r>
-      <w:proofErr w:type="spellEnd"/>
-      <w:r>
-        <w:rPr>
-          <w:rFonts w:asciiTheme="majorHAnsi" w:hAnsiTheme="majorHAnsi" w:cstheme="majorHAnsi"/>
-          <w:color w:val="000000" w:themeColor="text1"/>
-        </w:rPr>
-        <w:t>.</w:t>
+      <w:r>
+        <w:rPr>
+          <w:rFonts w:asciiTheme="majorHAnsi" w:hAnsiTheme="majorHAnsi" w:cstheme="majorHAnsi"/>
+          <w:color w:val="000000" w:themeColor="text1"/>
+        </w:rPr>
+        <w:t>CompromISO.</w:t>
       </w:r>
     </w:p>
     <w:p>
@@ -11127,23 +10801,13 @@
           <w:color w:val="000000" w:themeColor="text1"/>
         </w:rPr>
       </w:pPr>
-      <w:proofErr w:type="spellStart"/>
       <w:r>
         <w:rPr>
           <w:rFonts w:asciiTheme="majorHAnsi" w:hAnsiTheme="majorHAnsi" w:cstheme="majorHAnsi"/>
           <w:b/>
           <w:color w:val="000000" w:themeColor="text1"/>
         </w:rPr>
-        <w:t>Dannin</w:t>
-      </w:r>
-      <w:proofErr w:type="spellEnd"/>
-      <w:r>
-        <w:rPr>
-          <w:rFonts w:asciiTheme="majorHAnsi" w:hAnsiTheme="majorHAnsi" w:cstheme="majorHAnsi"/>
-          <w:b/>
-          <w:color w:val="000000" w:themeColor="text1"/>
-        </w:rPr>
-        <w:t xml:space="preserve"> Leonardo Gómez Rodríguez</w:t>
+        <w:t>Dannin Leonardo Gómez Rodríguez</w:t>
       </w:r>
     </w:p>
     <w:p>

</xml_diff>